<commit_message>
Se añade presentación y se modifica estilo de informe.
</commit_message>
<xml_diff>
--- a/Fase_1/Evidencias Grupales/1.4 - Informe.docx
+++ b/Fase_1/Evidencias Grupales/1.4 - Informe.docx
@@ -567,13 +567,13 @@
     <w:sdt>
       <w:sdtPr>
         <w:rPr>
-          <w:rFonts w:ascii="Arial" w:hAnsi="Arial" w:cs="Arial"/>
+          <w:rFonts w:ascii="Arial" w:eastAsiaTheme="minorHAnsi" w:hAnsi="Arial" w:cs="Arial"/>
           <w:b/>
           <w:bCs/>
           <w:color w:val="auto"/>
           <w:sz w:val="24"/>
           <w:szCs w:val="24"/>
-          <w:lang w:val="es-ES"/>
+          <w:lang w:val="es-ES" w:eastAsia="en-US"/>
         </w:rPr>
         <w:id w:val="1571460159"/>
         <w:docPartObj>
@@ -581,12 +581,7 @@
           <w:docPartUnique/>
         </w:docPartObj>
       </w:sdtPr>
-      <w:sdtEndPr>
-        <w:rPr>
-          <w:rFonts w:eastAsiaTheme="minorHAnsi"/>
-          <w:lang w:eastAsia="en-US"/>
-        </w:rPr>
-      </w:sdtEndPr>
+      <w:sdtEndPr/>
       <w:sdtContent>
         <w:p>
           <w:pPr>
@@ -4181,25 +4176,7 @@
           <w:sz w:val="24"/>
           <w:szCs w:val="24"/>
         </w:rPr>
-        <w:t xml:space="preserve">para montar </w:t>
-      </w:r>
-      <w:proofErr w:type="spellStart"/>
-      <w:r>
-        <w:rPr>
-          <w:rFonts w:ascii="Arial" w:hAnsi="Arial" w:cs="Arial"/>
-          <w:sz w:val="24"/>
-          <w:szCs w:val="24"/>
-        </w:rPr>
-        <w:t>el</w:t>
-      </w:r>
-      <w:proofErr w:type="spellEnd"/>
-      <w:r>
-        <w:rPr>
-          <w:rFonts w:ascii="Arial" w:hAnsi="Arial" w:cs="Arial"/>
-          <w:sz w:val="24"/>
-          <w:szCs w:val="24"/>
-        </w:rPr>
-        <w:t xml:space="preserve"> proyecto de forma </w:t>
+        <w:t xml:space="preserve">para montar el proyecto de forma </w:t>
       </w:r>
       <w:proofErr w:type="spellStart"/>
       <w:r>
@@ -4344,7 +4321,23 @@
           <w:sz w:val="24"/>
           <w:szCs w:val="24"/>
         </w:rPr>
-        <w:t>). Para abordarlo, se ha definido estrictamente qué funcionalidades quedan fuera y se utilizarán datos simulados (</w:t>
+        <w:t xml:space="preserve">). Para abordarlo, se ha definido estrictamente </w:t>
+      </w:r>
+      <w:r>
+        <w:rPr>
+          <w:rFonts w:ascii="Arial" w:hAnsi="Arial" w:cs="Arial"/>
+          <w:sz w:val="24"/>
+          <w:szCs w:val="24"/>
+        </w:rPr>
+        <w:t>que se u</w:t>
+      </w:r>
+      <w:r>
+        <w:rPr>
+          <w:rFonts w:ascii="Arial" w:hAnsi="Arial" w:cs="Arial"/>
+          <w:sz w:val="24"/>
+          <w:szCs w:val="24"/>
+        </w:rPr>
+        <w:t>tilizarán datos simulados (</w:t>
       </w:r>
       <w:proofErr w:type="spellStart"/>
       <w:r>
@@ -4585,6 +4578,143 @@
     </w:p>
     <w:p>
       <w:pPr>
+        <w:pStyle w:val="Ttulo1"/>
+        <w:rPr>
+          <w:rFonts w:eastAsiaTheme="minorHAnsi" w:cs="Arial"/>
+          <w:b w:val="0"/>
+          <w:szCs w:val="24"/>
+        </w:rPr>
+      </w:pPr>
+      <w:bookmarkStart w:id="9" w:name="_Toc219436860"/>
+      <w:r>
+        <w:rPr>
+          <w:rFonts w:eastAsiaTheme="minorHAnsi" w:cs="Arial"/>
+          <w:b w:val="0"/>
+          <w:szCs w:val="24"/>
+        </w:rPr>
+        <w:t>Para asegurar el éxito del proyecto "Sistema de Unidad Territorial" dentro de los plazos académicos establecidos, se ha determinado utilizar una Metodología de Desarrollo Iterativo e Incremental.</w:t>
+      </w:r>
+    </w:p>
+    <w:p>
+      <w:pPr>
+        <w:pStyle w:val="Ttulo1"/>
+        <w:rPr>
+          <w:rFonts w:eastAsiaTheme="minorHAnsi" w:cs="Arial"/>
+          <w:b w:val="0"/>
+          <w:szCs w:val="24"/>
+        </w:rPr>
+      </w:pPr>
+      <w:r>
+        <w:rPr>
+          <w:rFonts w:eastAsiaTheme="minorHAnsi" w:cs="Arial"/>
+          <w:b w:val="0"/>
+          <w:szCs w:val="24"/>
+        </w:rPr>
+        <w:t>Esta decisión estratégica responde a la necesidad de gestionar eficientemente la incertidumbre y complejidad inherente al desarrollo de software. A diferencia de un modelo en cascada tradicional, donde los errores de diseño pueden descubrirse tardíamente, este enfoque permite la construcción progresiva del sistema mediante ciclos de trabajo cortos y definidos. Dado que el proyecto será ejecutado por un único desarrollador, esta metodología es vital para mantener un control granular sobre el avance, permitiendo dividir la arquitectura monolítica del problema en módulos pequeños, manejables y verificables (</w:t>
+      </w:r>
+      <w:proofErr w:type="spellStart"/>
+      <w:r>
+        <w:rPr>
+          <w:rFonts w:eastAsiaTheme="minorHAnsi" w:cs="Arial"/>
+          <w:b w:val="0"/>
+          <w:szCs w:val="24"/>
+        </w:rPr>
+        <w:t>Login</w:t>
+      </w:r>
+      <w:proofErr w:type="spellEnd"/>
+      <w:r>
+        <w:rPr>
+          <w:rFonts w:eastAsiaTheme="minorHAnsi" w:cs="Arial"/>
+          <w:b w:val="0"/>
+          <w:szCs w:val="24"/>
+        </w:rPr>
+        <w:t>, Gestión de Noticias, Emisión de Certificados).</w:t>
+      </w:r>
+    </w:p>
+    <w:p>
+      <w:pPr>
+        <w:pStyle w:val="Ttulo1"/>
+        <w:rPr>
+          <w:rFonts w:eastAsiaTheme="minorHAnsi" w:cs="Arial"/>
+          <w:b w:val="0"/>
+          <w:szCs w:val="24"/>
+        </w:rPr>
+      </w:pPr>
+      <w:r>
+        <w:rPr>
+          <w:rFonts w:eastAsiaTheme="minorHAnsi" w:cs="Arial"/>
+          <w:b w:val="0"/>
+          <w:szCs w:val="24"/>
+        </w:rPr>
+        <w:t>El principal valor de este enfoque radica en la entrega temprana de funcionalidad operativa y la mitigación de riesgos técnicos. Cada iteración no solo añade nuevas características, sino que refina y valida las anteriores, asegurando que la arquitectura del sistema (</w:t>
+      </w:r>
+      <w:proofErr w:type="spellStart"/>
+      <w:r>
+        <w:rPr>
+          <w:rFonts w:eastAsiaTheme="minorHAnsi" w:cs="Arial"/>
+          <w:b w:val="0"/>
+          <w:szCs w:val="24"/>
+        </w:rPr>
+        <w:t>Backend</w:t>
+      </w:r>
+      <w:proofErr w:type="spellEnd"/>
+      <w:r>
+        <w:rPr>
+          <w:rFonts w:eastAsiaTheme="minorHAnsi" w:cs="Arial"/>
+          <w:b w:val="0"/>
+          <w:szCs w:val="24"/>
+        </w:rPr>
+        <w:t xml:space="preserve"> Spring </w:t>
+      </w:r>
+      <w:proofErr w:type="spellStart"/>
+      <w:r>
+        <w:rPr>
+          <w:rFonts w:eastAsiaTheme="minorHAnsi" w:cs="Arial"/>
+          <w:b w:val="0"/>
+          <w:szCs w:val="24"/>
+        </w:rPr>
+        <w:t>Boot</w:t>
+      </w:r>
+      <w:proofErr w:type="spellEnd"/>
+      <w:r>
+        <w:rPr>
+          <w:rFonts w:eastAsiaTheme="minorHAnsi" w:cs="Arial"/>
+          <w:b w:val="0"/>
+          <w:szCs w:val="24"/>
+        </w:rPr>
+        <w:t xml:space="preserve"> + </w:t>
+      </w:r>
+      <w:proofErr w:type="spellStart"/>
+      <w:r>
+        <w:rPr>
+          <w:rFonts w:eastAsiaTheme="minorHAnsi" w:cs="Arial"/>
+          <w:b w:val="0"/>
+          <w:szCs w:val="24"/>
+        </w:rPr>
+        <w:t>Frontend</w:t>
+      </w:r>
+      <w:proofErr w:type="spellEnd"/>
+      <w:r>
+        <w:rPr>
+          <w:rFonts w:eastAsiaTheme="minorHAnsi" w:cs="Arial"/>
+          <w:b w:val="0"/>
+          <w:szCs w:val="24"/>
+        </w:rPr>
+        <w:t xml:space="preserve"> Android) se mantenga robusta y escalable a medida que crece el código.</w:t>
+      </w:r>
+    </w:p>
+    <w:p/>
+    <w:bookmarkEnd w:id="9"/>
+    <w:p>
+      <w:pPr>
+        <w:pStyle w:val="Ttulo1"/>
+      </w:pPr>
+      <w:r>
+        <w:t>Plan de Trabajo</w:t>
+      </w:r>
+    </w:p>
+    <w:p>
+      <w:pPr>
         <w:spacing w:line="360" w:lineRule="auto"/>
         <w:jc w:val="both"/>
         <w:rPr>
@@ -4599,7 +4729,7 @@
           <w:sz w:val="24"/>
           <w:szCs w:val="24"/>
         </w:rPr>
-        <w:t>Para el desarrollo de este proyecto se utilizará una Metodología Iterativa e Incremental.</w:t>
+        <w:t>El desarrollo se articulará en cuatro ciclos o iteraciones principales, alineados con el cronograma del semestre, donde cada uno finalizará con un entregable tangible:</w:t>
       </w:r>
     </w:p>
     <w:p>
@@ -4614,40 +4744,36 @@
       </w:pPr>
       <w:r>
         <w:rPr>
-          <w:rFonts w:ascii="Arial" w:hAnsi="Arial" w:cs="Arial"/>
-          <w:sz w:val="24"/>
-          <w:szCs w:val="24"/>
-        </w:rPr>
-        <w:t>Se ha seleccionado este enfoque porque permite la entrega temprana de valor funcional y la mitigación de riesgos técnicos. Al trabajar solo, esta metodología me permite dividir el sistema en módulos pequeños y manejables (</w:t>
-      </w:r>
-      <w:proofErr w:type="spellStart"/>
-      <w:r>
-        <w:rPr>
-          <w:rFonts w:ascii="Arial" w:hAnsi="Arial" w:cs="Arial"/>
-          <w:sz w:val="24"/>
-          <w:szCs w:val="24"/>
-        </w:rPr>
-        <w:t>Login</w:t>
-      </w:r>
-      <w:proofErr w:type="spellEnd"/>
-      <w:r>
-        <w:rPr>
-          <w:rFonts w:ascii="Arial" w:hAnsi="Arial" w:cs="Arial"/>
-          <w:sz w:val="24"/>
-          <w:szCs w:val="24"/>
-        </w:rPr>
-        <w:t>, Noticias, Certificados) que se diseñan, construyen y prueban en ciclos cortos. Esto facilita la detección temprana de errores y permite ajustar la arquitectura sin comprometer todo el desarrollo, asegurando un avance constante y demostrable semana a semana.</w:t>
-      </w:r>
-    </w:p>
-    <w:p>
-      <w:pPr>
-        <w:pStyle w:val="Ttulo1"/>
-      </w:pPr>
-      <w:bookmarkStart w:id="9" w:name="_Toc219436860"/>
-      <w:r>
-        <w:t>Plan de Trabajo (Planificación Macro)</w:t>
-      </w:r>
-      <w:bookmarkEnd w:id="9"/>
+          <w:rStyle w:val="Ttulo2Car"/>
+        </w:rPr>
+        <w:t>Iteración 1 - Fundamentos, Alcance y Datos (Semanas 1-4):</w:t>
+      </w:r>
+      <w:r>
+        <w:rPr>
+          <w:rFonts w:ascii="Arial" w:hAnsi="Arial" w:cs="Arial"/>
+          <w:sz w:val="24"/>
+          <w:szCs w:val="24"/>
+        </w:rPr>
+        <w:t xml:space="preserve"> El foco estará en la definición del alcance, la infraestructura y el diseño de la información. En las primeras semanas se realizará el levantamiento de historias de usuario y la configuración del servidor de despliegue (</w:t>
+      </w:r>
+      <w:proofErr w:type="spellStart"/>
+      <w:r>
+        <w:rPr>
+          <w:rFonts w:ascii="Arial" w:hAnsi="Arial" w:cs="Arial"/>
+          <w:sz w:val="24"/>
+          <w:szCs w:val="24"/>
+        </w:rPr>
+        <w:t>TrueNAS</w:t>
+      </w:r>
+      <w:proofErr w:type="spellEnd"/>
+      <w:r>
+        <w:rPr>
+          <w:rFonts w:ascii="Arial" w:hAnsi="Arial" w:cs="Arial"/>
+          <w:sz w:val="24"/>
+          <w:szCs w:val="24"/>
+        </w:rPr>
+        <w:t>). Posteriormente, se consolidará el modelo de datos relacional (Entidad-Relación) y su implementación en PostgreSQL sobre Docker. El objetivo de este sprint es dejar los cimientos listos (entorno y base de datos) para iniciar la programación.</w:t>
+      </w:r>
     </w:p>
     <w:p>
       <w:pPr>
@@ -4659,14 +4785,6 @@
           <w:szCs w:val="24"/>
         </w:rPr>
       </w:pPr>
-      <w:r>
-        <w:rPr>
-          <w:rFonts w:ascii="Arial" w:hAnsi="Arial" w:cs="Arial"/>
-          <w:sz w:val="24"/>
-          <w:szCs w:val="24"/>
-        </w:rPr>
-        <w:t>El proyecto se ejecutará en un plazo de un semestre académico, estructurado en las siguientes fases:</w:t>
-      </w:r>
     </w:p>
     <w:p>
       <w:pPr>
@@ -4680,45 +4798,139 @@
       </w:pPr>
       <w:r>
         <w:rPr>
-          <w:rFonts w:ascii="Arial" w:hAnsi="Arial" w:cs="Arial"/>
-          <w:sz w:val="24"/>
-          <w:szCs w:val="24"/>
-        </w:rPr>
-        <w:t xml:space="preserve">Fase 1: Definición y Configuración (Semanas 1-3): Configuración del </w:t>
-      </w:r>
-      <w:r>
-        <w:rPr>
-          <w:rFonts w:ascii="Arial" w:hAnsi="Arial" w:cs="Arial"/>
-          <w:sz w:val="24"/>
-          <w:szCs w:val="24"/>
-        </w:rPr>
-        <w:t xml:space="preserve">contenedor Docker en </w:t>
-      </w:r>
-      <w:r>
-        <w:rPr>
-          <w:rFonts w:ascii="Arial" w:hAnsi="Arial" w:cs="Arial"/>
-          <w:sz w:val="24"/>
-          <w:szCs w:val="24"/>
-        </w:rPr>
-        <w:t xml:space="preserve">servidor </w:t>
-      </w:r>
-      <w:proofErr w:type="spellStart"/>
-      <w:r>
-        <w:rPr>
-          <w:rFonts w:ascii="Arial" w:hAnsi="Arial" w:cs="Arial"/>
-          <w:sz w:val="24"/>
-          <w:szCs w:val="24"/>
-        </w:rPr>
-        <w:t>TrueNAS</w:t>
-      </w:r>
-      <w:proofErr w:type="spellEnd"/>
-      <w:r>
-        <w:rPr>
-          <w:rFonts w:ascii="Arial" w:hAnsi="Arial" w:cs="Arial"/>
-          <w:sz w:val="24"/>
-          <w:szCs w:val="24"/>
-        </w:rPr>
-        <w:t>, levantamiento de base de datos PostgreSQL y diseño de API.</w:t>
+          <w:rStyle w:val="Ttulo2Car"/>
+        </w:rPr>
+        <w:t xml:space="preserve">Iteración 2 - Desarrollo del </w:t>
+      </w:r>
+      <w:proofErr w:type="spellStart"/>
+      <w:r>
+        <w:rPr>
+          <w:rStyle w:val="Ttulo2Car"/>
+        </w:rPr>
+        <w:t>Backend</w:t>
+      </w:r>
+      <w:proofErr w:type="spellEnd"/>
+      <w:r>
+        <w:rPr>
+          <w:rStyle w:val="Ttulo2Car"/>
+        </w:rPr>
+        <w:t xml:space="preserve"> y MVP Móvil (Semanas 4-8):</w:t>
+      </w:r>
+      <w:r>
+        <w:rPr>
+          <w:rFonts w:ascii="Arial" w:hAnsi="Arial" w:cs="Arial"/>
+          <w:sz w:val="24"/>
+          <w:szCs w:val="24"/>
+        </w:rPr>
+        <w:t xml:space="preserve"> En este ciclo se implementarán simultáneamente el </w:t>
+      </w:r>
+      <w:proofErr w:type="spellStart"/>
+      <w:r>
+        <w:rPr>
+          <w:rFonts w:ascii="Arial" w:hAnsi="Arial" w:cs="Arial"/>
+          <w:sz w:val="24"/>
+          <w:szCs w:val="24"/>
+        </w:rPr>
+        <w:t>Backend</w:t>
+      </w:r>
+      <w:proofErr w:type="spellEnd"/>
+      <w:r>
+        <w:rPr>
+          <w:rFonts w:ascii="Arial" w:hAnsi="Arial" w:cs="Arial"/>
+          <w:sz w:val="24"/>
+          <w:szCs w:val="24"/>
+        </w:rPr>
+        <w:t xml:space="preserve"> y la interfaz móvil. Se desarrollará la API REST con Spring </w:t>
+      </w:r>
+      <w:proofErr w:type="spellStart"/>
+      <w:r>
+        <w:rPr>
+          <w:rFonts w:ascii="Arial" w:hAnsi="Arial" w:cs="Arial"/>
+          <w:sz w:val="24"/>
+          <w:szCs w:val="24"/>
+        </w:rPr>
+        <w:t>Boot</w:t>
+      </w:r>
+      <w:proofErr w:type="spellEnd"/>
+      <w:r>
+        <w:rPr>
+          <w:rFonts w:ascii="Arial" w:hAnsi="Arial" w:cs="Arial"/>
+          <w:sz w:val="24"/>
+          <w:szCs w:val="24"/>
+        </w:rPr>
+        <w:t xml:space="preserve"> incluyendo seguridad (JWT/</w:t>
+      </w:r>
+      <w:proofErr w:type="spellStart"/>
+      <w:r>
+        <w:rPr>
+          <w:rFonts w:ascii="Arial" w:hAnsi="Arial" w:cs="Arial"/>
+          <w:sz w:val="24"/>
+          <w:szCs w:val="24"/>
+        </w:rPr>
+        <w:t>BCrypt</w:t>
+      </w:r>
+      <w:proofErr w:type="spellEnd"/>
+      <w:r>
+        <w:rPr>
+          <w:rFonts w:ascii="Arial" w:hAnsi="Arial" w:cs="Arial"/>
+          <w:sz w:val="24"/>
+          <w:szCs w:val="24"/>
+        </w:rPr>
+        <w:t>) y el CRUD de noticias. En paralelo, se construirá la aplicación Android (</w:t>
+      </w:r>
+      <w:proofErr w:type="spellStart"/>
+      <w:r>
+        <w:rPr>
+          <w:rFonts w:ascii="Arial" w:hAnsi="Arial" w:cs="Arial"/>
+          <w:sz w:val="24"/>
+          <w:szCs w:val="24"/>
+        </w:rPr>
+        <w:t>Kotlin</w:t>
+      </w:r>
+      <w:proofErr w:type="spellEnd"/>
+      <w:r>
+        <w:rPr>
+          <w:rFonts w:ascii="Arial" w:hAnsi="Arial" w:cs="Arial"/>
+          <w:sz w:val="24"/>
+          <w:szCs w:val="24"/>
+        </w:rPr>
+        <w:t xml:space="preserve">/MVVM) abarcando el </w:t>
+      </w:r>
+      <w:proofErr w:type="spellStart"/>
+      <w:r>
+        <w:rPr>
+          <w:rFonts w:ascii="Arial" w:hAnsi="Arial" w:cs="Arial"/>
+          <w:sz w:val="24"/>
+          <w:szCs w:val="24"/>
+        </w:rPr>
+        <w:t>Login</w:t>
+      </w:r>
+      <w:proofErr w:type="spellEnd"/>
+      <w:r>
+        <w:rPr>
+          <w:rFonts w:ascii="Arial" w:hAnsi="Arial" w:cs="Arial"/>
+          <w:sz w:val="24"/>
+          <w:szCs w:val="24"/>
+        </w:rPr>
+        <w:t xml:space="preserve">, </w:t>
+      </w:r>
+      <w:proofErr w:type="spellStart"/>
+      <w:r>
+        <w:rPr>
+          <w:rFonts w:ascii="Arial" w:hAnsi="Arial" w:cs="Arial"/>
+          <w:sz w:val="24"/>
+          <w:szCs w:val="24"/>
+        </w:rPr>
+        <w:t>Feed</w:t>
+      </w:r>
+      <w:proofErr w:type="spellEnd"/>
+      <w:r>
+        <w:rPr>
+          <w:rFonts w:ascii="Arial" w:hAnsi="Arial" w:cs="Arial"/>
+          <w:sz w:val="24"/>
+          <w:szCs w:val="24"/>
+        </w:rPr>
+        <w:t xml:space="preserve"> de Noticias y Perfil. Al finalizar este sprint (Semana 8), se tendrá el Producto Mínimo Viable (MVP) funcional tanto en servidor como en cliente móvil.</w:t>
       </w:r>
     </w:p>
     <w:p>
@@ -4731,50 +4943,6 @@
           <w:szCs w:val="24"/>
         </w:rPr>
       </w:pPr>
-      <w:r>
-        <w:rPr>
-          <w:rFonts w:ascii="Arial" w:hAnsi="Arial" w:cs="Arial"/>
-          <w:sz w:val="24"/>
-          <w:szCs w:val="24"/>
-        </w:rPr>
-        <w:t xml:space="preserve">Fase 2: Core del Sistema (Semanas 4-7): Desarrollo del </w:t>
-      </w:r>
-      <w:proofErr w:type="spellStart"/>
-      <w:r>
-        <w:rPr>
-          <w:rFonts w:ascii="Arial" w:hAnsi="Arial" w:cs="Arial"/>
-          <w:sz w:val="24"/>
-          <w:szCs w:val="24"/>
-        </w:rPr>
-        <w:t>Backend</w:t>
-      </w:r>
-      <w:proofErr w:type="spellEnd"/>
-      <w:r>
-        <w:rPr>
-          <w:rFonts w:ascii="Arial" w:hAnsi="Arial" w:cs="Arial"/>
-          <w:sz w:val="24"/>
-          <w:szCs w:val="24"/>
-        </w:rPr>
-        <w:t xml:space="preserve"> (Spring </w:t>
-      </w:r>
-      <w:proofErr w:type="spellStart"/>
-      <w:r>
-        <w:rPr>
-          <w:rFonts w:ascii="Arial" w:hAnsi="Arial" w:cs="Arial"/>
-          <w:sz w:val="24"/>
-          <w:szCs w:val="24"/>
-        </w:rPr>
-        <w:t>Boot</w:t>
-      </w:r>
-      <w:proofErr w:type="spellEnd"/>
-      <w:r>
-        <w:rPr>
-          <w:rFonts w:ascii="Arial" w:hAnsi="Arial" w:cs="Arial"/>
-          <w:sz w:val="24"/>
-          <w:szCs w:val="24"/>
-        </w:rPr>
-        <w:t>) para autenticación (JWT) y CRUD de noticias. Desarrollo de interfaz base en Android.</w:t>
-      </w:r>
     </w:p>
     <w:p>
       <w:pPr>
@@ -4788,29 +4956,35 @@
       </w:pPr>
       <w:r>
         <w:rPr>
-          <w:rFonts w:ascii="Arial" w:hAnsi="Arial" w:cs="Arial"/>
-          <w:sz w:val="24"/>
-          <w:szCs w:val="24"/>
-        </w:rPr>
-        <w:t xml:space="preserve">Fase 3: Funcionalidad Crítica (Semanas 8-11): Implementación del módulo de Certificados y lógica de negocio para solicitudes vecinales. Generación de </w:t>
-      </w:r>
-      <w:proofErr w:type="spellStart"/>
-      <w:r>
-        <w:rPr>
-          <w:rFonts w:ascii="Arial" w:hAnsi="Arial" w:cs="Arial"/>
-          <w:sz w:val="24"/>
-          <w:szCs w:val="24"/>
-        </w:rPr>
-        <w:t>PDFs</w:t>
-      </w:r>
-      <w:proofErr w:type="spellEnd"/>
-      <w:r>
-        <w:rPr>
-          <w:rFonts w:ascii="Arial" w:hAnsi="Arial" w:cs="Arial"/>
-          <w:sz w:val="24"/>
-          <w:szCs w:val="24"/>
-        </w:rPr>
-        <w:t>.</w:t>
+          <w:rStyle w:val="Ttulo2Car"/>
+        </w:rPr>
+        <w:t>Iteración 3 - Lógica de Negocio y Gestión Documental (Semanas 9-12):</w:t>
+      </w:r>
+      <w:r>
+        <w:rPr>
+          <w:rFonts w:ascii="Arial" w:hAnsi="Arial" w:cs="Arial"/>
+          <w:sz w:val="24"/>
+          <w:szCs w:val="24"/>
+        </w:rPr>
+        <w:t xml:space="preserve"> Esta fase abordará la funcionalidad más compleja y de mayor valor: la gestión de certificados. Se programará la lógica de negocio para la solicitud, aprobación y generación automática de Certificados de Residencia en formato PDF inmutable. Se integrarán las librerías necesarias en el </w:t>
+      </w:r>
+      <w:proofErr w:type="spellStart"/>
+      <w:r>
+        <w:rPr>
+          <w:rFonts w:ascii="Arial" w:hAnsi="Arial" w:cs="Arial"/>
+          <w:sz w:val="24"/>
+          <w:szCs w:val="24"/>
+        </w:rPr>
+        <w:t>backend</w:t>
+      </w:r>
+      <w:proofErr w:type="spellEnd"/>
+      <w:r>
+        <w:rPr>
+          <w:rFonts w:ascii="Arial" w:hAnsi="Arial" w:cs="Arial"/>
+          <w:sz w:val="24"/>
+          <w:szCs w:val="24"/>
+        </w:rPr>
+        <w:t xml:space="preserve"> y se asegurará el correcto almacenamiento de estos documentos en el servidor.</w:t>
       </w:r>
     </w:p>
     <w:p>
@@ -4823,14 +4997,6 @@
           <w:szCs w:val="24"/>
         </w:rPr>
       </w:pPr>
-      <w:r>
-        <w:rPr>
-          <w:rFonts w:ascii="Arial" w:hAnsi="Arial" w:cs="Arial"/>
-          <w:sz w:val="24"/>
-          <w:szCs w:val="24"/>
-        </w:rPr>
-        <w:t>Fase 4: Refinamiento y Cierre (Semanas 12-15): Pruebas de integración, corrección de bugs, optimización de UI/UX y documentación final.</w:t>
-      </w:r>
     </w:p>
     <w:p>
       <w:pPr>
@@ -4842,6 +5008,38 @@
           <w:szCs w:val="24"/>
         </w:rPr>
       </w:pPr>
+      <w:r>
+        <w:rPr>
+          <w:rStyle w:val="Ttulo2Car"/>
+        </w:rPr>
+        <w:t>Iteración 4 - Calidad (QA) y Cierre del Proyecto (Semanas 13-15):</w:t>
+      </w:r>
+      <w:r>
+        <w:rPr>
+          <w:rFonts w:ascii="Arial" w:hAnsi="Arial" w:cs="Arial"/>
+          <w:sz w:val="24"/>
+          <w:szCs w:val="24"/>
+        </w:rPr>
+        <w:t xml:space="preserve"> El último ciclo se dedicará exclusivamente a las pruebas de certificación y cierre. Se ejecutarán pruebas integrales (</w:t>
+      </w:r>
+      <w:proofErr w:type="spellStart"/>
+      <w:r>
+        <w:rPr>
+          <w:rFonts w:ascii="Arial" w:hAnsi="Arial" w:cs="Arial"/>
+          <w:sz w:val="24"/>
+          <w:szCs w:val="24"/>
+        </w:rPr>
+        <w:t>Backend</w:t>
+      </w:r>
+      <w:proofErr w:type="spellEnd"/>
+      <w:r>
+        <w:rPr>
+          <w:rFonts w:ascii="Arial" w:hAnsi="Arial" w:cs="Arial"/>
+          <w:sz w:val="24"/>
+          <w:szCs w:val="24"/>
+        </w:rPr>
+        <w:t>-App-BD) para detectar y corregir errores, asegurando la calidad del software. Además, se recopilará toda la documentación técnica y las evidencias de pruebas exitosas necesarias para la defensa final del proyecto.</w:t>
+      </w:r>
     </w:p>
     <w:p>
       <w:pPr>
@@ -4888,7 +5086,6 @@
           <w:sz w:val="24"/>
           <w:szCs w:val="24"/>
         </w:rPr>
-        <w:lastRenderedPageBreak/>
         <w:t xml:space="preserve">Repositorio de Código (GitHub): Historial de </w:t>
       </w:r>
       <w:proofErr w:type="spellStart"/>
@@ -5018,6 +5215,7 @@
           <w:sz w:val="24"/>
           <w:szCs w:val="24"/>
         </w:rPr>
+        <w:lastRenderedPageBreak/>
         <w:t>API REST funcional desplegada y documentada (</w:t>
       </w:r>
       <w:proofErr w:type="spellStart"/>
@@ -7769,7 +7967,6 @@
           <w:sz w:val="24"/>
           <w:szCs w:val="24"/>
         </w:rPr>
-        <w:lastRenderedPageBreak/>
         <w:t>to</w:t>
       </w:r>
       <w:proofErr w:type="spellEnd"/>
@@ -8972,6 +9169,7 @@
   <w:style w:type="character" w:default="1" w:styleId="Fuentedeprrafopredeter">
     <w:name w:val="Default Paragraph Font"/>
     <w:uiPriority w:val="1"/>
+    <w:semiHidden/>
     <w:unhideWhenUsed/>
   </w:style>
   <w:style w:type="table" w:default="1" w:styleId="Tablanormal">

</xml_diff>